<commit_message>
Correct sensor analysis: calendar confound, leakage note, add paper toolkit
</commit_message>
<xml_diff>
--- a/docs/technical_report.docx
+++ b/docs/technical_report.docx
@@ -13,7 +13,7 @@
           <w:sz w:val="32"/>
           <w:szCs w:val="32"/>
         </w:rPr>
-        <w:t xml:space="preserve">AI-Driven Vision and IoT System for Nutrient Stress Detection and Growth Monitoring in Indoor Hydroponic Farming</w:t>
+        <w:t xml:space="preserve">A Vision and IoT-Sensor Prototype for Hydroponic Crop Monitoring, and a Case Study in Validity Pitfalls</w:t>
       </w:r>
     </w:p>
     <w:p>
@@ -28,7 +28,7 @@
           <w:sz w:val="22"/>
           <w:szCs w:val="22"/>
         </w:rPr>
-        <w:t xml:space="preserve">A prototype system toward addressing Gulf-region food security through controlled-environment agriculture</w:t>
+        <w:t xml:space="preserve">Motivated by Gulf-region food security and controlled-environment agriculture</w:t>
       </w:r>
     </w:p>
     <w:p>
@@ -41,7 +41,7 @@
           <w:sz w:val="20"/>
           <w:szCs w:val="20"/>
         </w:rPr>
-        <w:t xml:space="preserve">Habib Adnan  |  Independent research prototype, prepared for PhD application</w:t>
+        <w:t xml:space="preserve">Habib Adnan Abdulla  |  Independent research prototype, prepared for PhD application</w:t>
       </w:r>
     </w:p>
     <w:p>
@@ -58,7 +58,7 @@
         <w:spacing w:after="150"/>
       </w:pPr>
       <w:r>
-        <w:t xml:space="preserve">Gulf Cooperation Council countries import the substantial majority of their food due to arid climate, water scarcity, and limited arable land. Indoor hydroponic farming offers a path toward food security in this context, but scaling it requires reducing dependence on manual monitoring of plant health and nutrient conditions. This project prototypes an AI-driven monitoring system that combines computer vision (leaf-level nutrient stress and disease detection) with IoT sensor analysis (environmental growth prediction) as a foundation for autonomous, low-labor indoor farm management suited to regional climate constraints.</w:t>
+        <w:t xml:space="preserve">Gulf Cooperation Council countries import most of their food because of arid climate, water scarcity and limited arable land. Indoor hydroponic farming is one path toward food security, but scaling it depends on reducing manual monitoring of plant health and nutrient conditions. This project prototypes machine-learning components for such monitoring: computer vision for leaf-level stress and disease, and sensor-based modelling of growth. Its second purpose is methodological: to test, with proper validation, how far public datasets can support claims about these systems.</w:t>
       </w:r>
     </w:p>
     <w:p>
@@ -66,7 +66,7 @@
         <w:spacing w:after="150"/>
       </w:pPr>
       <w:r>
-        <w:t xml:space="preserve">The work was undertaken independently, prior to and in support of a PhD application, to demonstrate applied capability in machine learning, systems thinking, and the specific intersection of AI and IoT relevant to controlled-environment agriculture.</w:t>
+        <w:t xml:space="preserve">The work was done independently as preparation for doctoral research, to demonstrate applied machine-learning ability and honest evaluation practice in the intersection of AI and IoT.</w:t>
       </w:r>
     </w:p>
     <w:p>
@@ -75,15 +75,7 @@
         <w:spacing w:after="150" w:before="300"/>
       </w:pPr>
       <w:r>
-        <w:t xml:space="preserve">2. System Overview</w:t>
-      </w:r>
-    </w:p>
-    <w:p>
-      <w:pPr>
-        <w:spacing w:after="150"/>
-      </w:pPr>
-      <w:r>
-        <w:t xml:space="preserve">The system consists of two independently trained components, unified under a single interactive demo application:</w:t>
+        <w:t xml:space="preserve">2. Overview</w:t>
       </w:r>
     </w:p>
     <w:p>
@@ -96,7 +88,7 @@
         <w:spacing w:after="80"/>
       </w:pPr>
       <w:r>
-        <w:t xml:space="preserve">A vision-based classifier that identifies nutrient deficiency (Nitrogen, Potassium) and fungal disease (Wilt) from a photograph of a lettuce leaf.</w:t>
+        <w:t xml:space="preserve">A vision classifier that identifies nitrogen deficiency, potassium deficiency and fungal wilt from photographs of lettuce leaves.</w:t>
       </w:r>
     </w:p>
     <w:p>
@@ -109,7 +101,7 @@
         <w:spacing w:after="80"/>
       </w:pPr>
       <w:r>
-        <w:t xml:space="preserve">A sensor-based regressor that predicts a plant's growth stage (day within a 48-day cycle) from environmental readings: temperature, humidity, total dissolved solids (TDS), and pH.</w:t>
+        <w:t xml:space="preserve">A sensor-based regressor that predicts growth day from temperature, humidity, total dissolved solids (TDS) and pH, together with a validity analysis of what that model can and cannot be said to have learned.</w:t>
       </w:r>
     </w:p>
     <w:p>
@@ -117,7 +109,7 @@
         <w:spacing w:after="150"/>
       </w:pPr>
       <w:r>
-        <w:t xml:space="preserve">Both components share a common motivation: detecting plant stress earlier and more reliably than manual inspection allows, using signals (visual and environmental) that are each individually informative but incomplete on their own. This motivates the primary direction of future work: multi-modal fusion of both signals, discussed in Section 6.</w:t>
+        <w:t xml:space="preserve">Both are exposed in an interactive Streamlit demonstration. The two models are trained independently; combining them (multi-modal fusion) is proposed future work and has not been built or evaluated.</w:t>
       </w:r>
     </w:p>
     <w:p>
@@ -143,7 +135,7 @@
         <w:spacing w:after="150"/>
       </w:pPr>
       <w:r>
-        <w:t xml:space="preserve">The Locarno Lettuce Disease Dataset (Rathor, Kaggle; CC0 Public Domain) was used, collected from a Raspberry Pi 4B-monitored Nutrient Film Technique (NFT) vertical hydroponics system at the University of Petroleum and Energy Studies, India. The dataset contains 209 images across four classes: Healthy (62), Potassium Deficient (66), Nitrogen Deficient (36), and Wilt (fungal, 45). Notably, the source system also logged pH, TDS, temperature, and humidity alongside imagery — direct precedent for the vision + IoT fusion approach this project builds toward.</w:t>
+        <w:t xml:space="preserve">The Lettuce Plant Leaf Disease Dataset (Rathor, Kaggle; CC0) was collected from a Raspberry Pi-monitored Nutrient Film Technique system at the University of Petroleum and Energy Studies, India. It contains 209 images in four classes: Healthy (62), Potassium deficient (66), Nitrogen deficient (36) and Wilt (45).</w:t>
       </w:r>
     </w:p>
     <w:p>
@@ -160,7 +152,7 @@
         <w:spacing w:after="150"/>
       </w:pPr>
       <w:r>
-        <w:t xml:space="preserve">Data was split 70/15/15 (train/val/test) with stratification by class. Given the small dataset size, a MobileNetV2 backbone pretrained on ImageNet was used with a frozen feature extractor and a fine-tuned classification head — a standard transfer-learning approach appropriate for limited data. Training-set augmentation (rotation, color jitter, random resized crop) was applied to improve robustness given the small sample size, particularly for the minority Nitrogen-deficient class.</w:t>
+        <w:t xml:space="preserve">Images were split 70/15/15 with stratification by class. A MobileNetV2 backbone pretrained on ImageNet was used with a frozen feature extractor and a trained classification head, with rotation, colour-jitter and random-crop augmentation on the training set. A second run applied inverse-frequency class weighting to the loss.</w:t>
       </w:r>
     </w:p>
     <w:p>
@@ -169,7 +161,7 @@
         <w:spacing w:after="100" w:before="200"/>
       </w:pPr>
       <w:r>
-        <w:t xml:space="preserve">3.3 Results</w:t>
+        <w:t xml:space="preserve">3.3 Results (single split, indicative only)</w:t>
       </w:r>
     </w:p>
     <w:tbl>
@@ -202,6 +194,8 @@
                 <w:b/>
                 <w:bCs/>
                 <w:color w:val="FFFFFF"/>
+                <w:sz w:val="19"/>
+                <w:szCs w:val="19"/>
               </w:rPr>
               <w:t xml:space="preserve">Class</w:t>
             </w:r>
@@ -218,6 +212,8 @@
                 <w:b/>
                 <w:bCs/>
                 <w:color w:val="FFFFFF"/>
+                <w:sz w:val="19"/>
+                <w:szCs w:val="19"/>
               </w:rPr>
               <w:t xml:space="preserve">Precision</w:t>
             </w:r>
@@ -234,6 +230,8 @@
                 <w:b/>
                 <w:bCs/>
                 <w:color w:val="FFFFFF"/>
+                <w:sz w:val="19"/>
+                <w:szCs w:val="19"/>
               </w:rPr>
               <w:t xml:space="preserve">Recall</w:t>
             </w:r>
@@ -250,6 +248,8 @@
                 <w:b/>
                 <w:bCs/>
                 <w:color w:val="FFFFFF"/>
+                <w:sz w:val="19"/>
+                <w:szCs w:val="19"/>
               </w:rPr>
               <w:t xml:space="preserve">F1</w:t>
             </w:r>
@@ -266,6 +266,8 @@
               <w:rPr>
                 <w:b w:val="false"/>
                 <w:bCs w:val="false"/>
+                <w:sz w:val="19"/>
+                <w:szCs w:val="19"/>
               </w:rPr>
               <w:t xml:space="preserve">Healthy</w:t>
             </w:r>
@@ -280,6 +282,8 @@
               <w:rPr>
                 <w:b w:val="false"/>
                 <w:bCs w:val="false"/>
+                <w:sz w:val="19"/>
+                <w:szCs w:val="19"/>
               </w:rPr>
               <w:t xml:space="preserve">1.00</w:t>
             </w:r>
@@ -294,6 +298,8 @@
               <w:rPr>
                 <w:b w:val="false"/>
                 <w:bCs w:val="false"/>
+                <w:sz w:val="19"/>
+                <w:szCs w:val="19"/>
               </w:rPr>
               <w:t xml:space="preserve">0.90</w:t>
             </w:r>
@@ -308,6 +314,8 @@
               <w:rPr>
                 <w:b w:val="false"/>
                 <w:bCs w:val="false"/>
+                <w:sz w:val="19"/>
+                <w:szCs w:val="19"/>
               </w:rPr>
               <w:t xml:space="preserve">0.95</w:t>
             </w:r>
@@ -324,20 +332,24 @@
               <w:rPr>
                 <w:b w:val="false"/>
                 <w:bCs w:val="false"/>
-              </w:rPr>
-              <w:t xml:space="preserve">K Deficient</w:t>
-            </w:r>
-          </w:p>
-        </w:tc>
-        <w:tc>
-          <w:tcPr>
-            <w:tcW w:type="dxa" w:w="2250"/>
-          </w:tcPr>
-          <w:p>
-            <w:r>
-              <w:rPr>
-                <w:b w:val="false"/>
-                <w:bCs w:val="false"/>
+                <w:sz w:val="19"/>
+                <w:szCs w:val="19"/>
+              </w:rPr>
+              <w:t xml:space="preserve">K deficient</w:t>
+            </w:r>
+          </w:p>
+        </w:tc>
+        <w:tc>
+          <w:tcPr>
+            <w:tcW w:type="dxa" w:w="2250"/>
+          </w:tcPr>
+          <w:p>
+            <w:r>
+              <w:rPr>
+                <w:b w:val="false"/>
+                <w:bCs w:val="false"/>
+                <w:sz w:val="19"/>
+                <w:szCs w:val="19"/>
               </w:rPr>
               <w:t xml:space="preserve">0.91</w:t>
             </w:r>
@@ -352,6 +364,8 @@
               <w:rPr>
                 <w:b w:val="false"/>
                 <w:bCs w:val="false"/>
+                <w:sz w:val="19"/>
+                <w:szCs w:val="19"/>
               </w:rPr>
               <w:t xml:space="preserve">0.91</w:t>
             </w:r>
@@ -366,6 +380,8 @@
               <w:rPr>
                 <w:b w:val="false"/>
                 <w:bCs w:val="false"/>
+                <w:sz w:val="19"/>
+                <w:szCs w:val="19"/>
               </w:rPr>
               <w:t xml:space="preserve">0.91</w:t>
             </w:r>
@@ -382,20 +398,24 @@
               <w:rPr>
                 <w:b w:val="false"/>
                 <w:bCs w:val="false"/>
-              </w:rPr>
-              <w:t xml:space="preserve">N Deficient</w:t>
-            </w:r>
-          </w:p>
-        </w:tc>
-        <w:tc>
-          <w:tcPr>
-            <w:tcW w:type="dxa" w:w="2250"/>
-          </w:tcPr>
-          <w:p>
-            <w:r>
-              <w:rPr>
-                <w:b w:val="false"/>
-                <w:bCs w:val="false"/>
+                <w:sz w:val="19"/>
+                <w:szCs w:val="19"/>
+              </w:rPr>
+              <w:t xml:space="preserve">N deficient</w:t>
+            </w:r>
+          </w:p>
+        </w:tc>
+        <w:tc>
+          <w:tcPr>
+            <w:tcW w:type="dxa" w:w="2250"/>
+          </w:tcPr>
+          <w:p>
+            <w:r>
+              <w:rPr>
+                <w:b w:val="false"/>
+                <w:bCs w:val="false"/>
+                <w:sz w:val="19"/>
+                <w:szCs w:val="19"/>
               </w:rPr>
               <w:t xml:space="preserve">0.86</w:t>
             </w:r>
@@ -410,6 +430,8 @@
               <w:rPr>
                 <w:b w:val="false"/>
                 <w:bCs w:val="false"/>
+                <w:sz w:val="19"/>
+                <w:szCs w:val="19"/>
               </w:rPr>
               <w:t xml:space="preserve">1.00</w:t>
             </w:r>
@@ -424,6 +446,8 @@
               <w:rPr>
                 <w:b w:val="false"/>
                 <w:bCs w:val="false"/>
+                <w:sz w:val="19"/>
+                <w:szCs w:val="19"/>
               </w:rPr>
               <w:t xml:space="preserve">0.92</w:t>
             </w:r>
@@ -440,6 +464,8 @@
               <w:rPr>
                 <w:b w:val="false"/>
                 <w:bCs w:val="false"/>
+                <w:sz w:val="19"/>
+                <w:szCs w:val="19"/>
               </w:rPr>
               <w:t xml:space="preserve">Wilt (fungal)</w:t>
             </w:r>
@@ -454,6 +480,8 @@
               <w:rPr>
                 <w:b w:val="false"/>
                 <w:bCs w:val="false"/>
+                <w:sz w:val="19"/>
+                <w:szCs w:val="19"/>
               </w:rPr>
               <w:t xml:space="preserve">0.88</w:t>
             </w:r>
@@ -468,6 +496,8 @@
               <w:rPr>
                 <w:b w:val="false"/>
                 <w:bCs w:val="false"/>
+                <w:sz w:val="19"/>
+                <w:szCs w:val="19"/>
               </w:rPr>
               <w:t xml:space="preserve">0.88</w:t>
             </w:r>
@@ -482,6 +512,8 @@
               <w:rPr>
                 <w:b w:val="false"/>
                 <w:bCs w:val="false"/>
+                <w:sz w:val="19"/>
+                <w:szCs w:val="19"/>
               </w:rPr>
               <w:t xml:space="preserve">0.88</w:t>
             </w:r>
@@ -491,15 +523,15 @@
     </w:tbl>
     <w:p>
       <w:pPr>
+        <w:spacing w:after="120"/>
+      </w:pPr>
+    </w:p>
+    <w:p>
+      <w:pPr>
         <w:spacing w:after="150"/>
       </w:pPr>
-    </w:p>
-    <w:p>
-      <w:pPr>
-        <w:spacing w:after="150"/>
-      </w:pPr>
-      <w:r>
-        <w:t xml:space="preserve">Overall test accuracy: 91% (35 held-out test images). An initial unweighted training run achieved a higher overall accuracy (94%) but with markedly weaker recall on the Nitrogen-deficient class (67%) — the smallest training class (25 images). Applying inverse-frequency class weighting to the loss function corrected this gap entirely (67% → 100% recall) at a modest cost to overall accuracy. This trade-off was judged worthwhile: in a deployed monitoring system, an undetected nitrogen deficiency (false negative) compounds in cost over time, whereas a misclassification among majority classes is more readily caught on a subsequent inspection.</w:t>
+      <w:r>
+        <w:t xml:space="preserve">Class-weighted model, 35 held-out images, overall accuracy 91%. The unweighted model reached 94% accuracy but only 67% recall on the nitrogen-deficient class (2 of 6 test images missed); class weighting raised that recall to 100% at a small cost in overall accuracy. With six test images in that class, these differences are within sampling noise and should not be over-interpreted.</w:t>
       </w:r>
     </w:p>
     <w:p>
@@ -508,7 +540,7 @@
         <w:spacing w:after="100" w:before="200"/>
       </w:pPr>
       <w:r>
-        <w:t xml:space="preserve">3.4 Limitation</w:t>
+        <w:t xml:space="preserve">3.4 Leakage analysis</w:t>
       </w:r>
     </w:p>
     <w:p>
@@ -516,7 +548,7 @@
         <w:spacing w:after="150"/>
       </w:pPr>
       <w:r>
-        <w:t xml:space="preserve">The test set (35 images, 6–11 per class) is small; these metrics are indicative rather than statistically robust. Larger-scale data collection, particularly for the Nitrogen-deficient class, is identified as future work.</w:t>
+        <w:t xml:space="preserve">The dataset has no plant identifiers. A 64-bit perceptual-hash analysis found 25 groups of near-duplicate images (52 of 209 images) and showed that 3 of the 35 test images (8.6%) have a near-identical image in the training set. The single-split accuracy is therefore probably optimistic. Group-aware cross-validation, with near-duplicates kept in the same fold, is used to produce the reportable estimate. The hash check cannot detect different views of the same plant, so some leakage may remain undetected.</w:t>
       </w:r>
     </w:p>
     <w:p>
@@ -525,7 +557,7 @@
         <w:spacing w:after="150" w:before="300"/>
       </w:pPr>
       <w:r>
-        <w:t xml:space="preserve">4. Component 2: Sensor-Based Growth-Day Predictor</w:t>
+        <w:t xml:space="preserve">4. Component 2: Sensor-Based Growth-Day Model and a Validity Finding</w:t>
       </w:r>
     </w:p>
     <w:p>
@@ -542,7 +574,7 @@
         <w:spacing w:after="150"/>
       </w:pPr>
       <w:r>
-        <w:t xml:space="preserve">A second Kaggle dataset ("Lettuce Growth Days," jurijsruko) was used: 3,169 daily sensor readings (temperature, humidity, TDS, pH) across 70 individually tracked plants over a 48-day growth cycle.</w:t>
+        <w:t xml:space="preserve">The Lettuce Growth Days dataset (jurijsruko, Kaggle; Apache-2.0) contains 3,169 daily readings of temperature, humidity, TDS and pH for 70 plants over a 48-day window. The target is Growth Day, a counter of days since a plant started being monitored.</w:t>
       </w:r>
     </w:p>
     <w:p>
@@ -559,7 +591,7 @@
         <w:spacing w:after="150"/>
       </w:pPr>
       <w:r>
-        <w:t xml:space="preserve">Because readings are repeated measurements of the same 70 plants over time, the data was split by Plant_ID (49/10/11 plants for train/val/test) rather than by row, preventing information leakage across a single plant's growth trajectory. A Random Forest Regressor (200 trees, max depth 10) was trained to predict growth day from the four sensor features — a model choice appropriately scaled to a four-feature tabular regression problem, rather than defaulting to a deep learning approach where it was not warranted.</w:t>
+        <w:t xml:space="preserve">Models were evaluated with plant-grouped cross-validation (5 folds, 5 repeats) so that no plant appears in both training and test folds. To test what the model was actually using, we compared feature sets, including a model given only the calendar date.</w:t>
       </w:r>
     </w:p>
     <w:p>
@@ -584,14 +616,15 @@
         </w:tblBorders>
       </w:tblPr>
       <w:tblGrid>
-        <w:gridCol w:w="3000"/>
-        <w:gridCol w:w="3000"/>
-        <w:gridCol w:w="3000"/>
+        <w:gridCol w:w="3300"/>
+        <w:gridCol w:w="2100"/>
+        <w:gridCol w:w="2000"/>
+        <w:gridCol w:w="1600"/>
       </w:tblGrid>
       <w:tr>
         <w:tc>
           <w:tcPr>
-            <w:tcW w:type="dxa" w:w="3000"/>
+            <w:tcW w:type="dxa" w:w="3300"/>
             <w:shd w:fill="2E5339" w:val="clear"/>
           </w:tcPr>
           <w:p>
@@ -600,14 +633,16 @@
                 <w:b/>
                 <w:bCs/>
                 <w:color w:val="FFFFFF"/>
-              </w:rPr>
-              <w:t xml:space="preserve">Metric</w:t>
-            </w:r>
-          </w:p>
-        </w:tc>
-        <w:tc>
-          <w:tcPr>
-            <w:tcW w:type="dxa" w:w="3000"/>
+                <w:sz w:val="19"/>
+                <w:szCs w:val="19"/>
+              </w:rPr>
+              <w:t xml:space="preserve">Features</w:t>
+            </w:r>
+          </w:p>
+        </w:tc>
+        <w:tc>
+          <w:tcPr>
+            <w:tcW w:type="dxa" w:w="2100"/>
             <w:shd w:fill="2E5339" w:val="clear"/>
           </w:tcPr>
           <w:p>
@@ -616,14 +651,16 @@
                 <w:b/>
                 <w:bCs/>
                 <w:color w:val="FFFFFF"/>
-              </w:rPr>
-              <w:t xml:space="preserve">Validation</w:t>
-            </w:r>
-          </w:p>
-        </w:tc>
-        <w:tc>
-          <w:tcPr>
-            <w:tcW w:type="dxa" w:w="3000"/>
+                <w:sz w:val="19"/>
+                <w:szCs w:val="19"/>
+              </w:rPr>
+              <w:t xml:space="preserve">Model</w:t>
+            </w:r>
+          </w:p>
+        </w:tc>
+        <w:tc>
+          <w:tcPr>
+            <w:tcW w:type="dxa" w:w="2000"/>
             <w:shd w:fill="2E5339" w:val="clear"/>
           </w:tcPr>
           <w:p>
@@ -632,8 +669,28 @@
                 <w:b/>
                 <w:bCs/>
                 <w:color w:val="FFFFFF"/>
-              </w:rPr>
-              <w:t xml:space="preserve">Test</w:t>
+                <w:sz w:val="19"/>
+                <w:szCs w:val="19"/>
+              </w:rPr>
+              <w:t xml:space="preserve">R² (mean ± SD)</w:t>
+            </w:r>
+          </w:p>
+        </w:tc>
+        <w:tc>
+          <w:tcPr>
+            <w:tcW w:type="dxa" w:w="1600"/>
+            <w:shd w:fill="2E5339" w:val="clear"/>
+          </w:tcPr>
+          <w:p>
+            <w:r>
+              <w:rPr>
+                <w:b/>
+                <w:bCs/>
+                <w:color w:val="FFFFFF"/>
+                <w:sz w:val="19"/>
+                <w:szCs w:val="19"/>
+              </w:rPr>
+              <w:t xml:space="preserve">MAE, days</w:t>
             </w:r>
           </w:p>
         </w:tc>
@@ -641,43 +698,65 @@
       <w:tr>
         <w:tc>
           <w:tcPr>
-            <w:tcW w:type="dxa" w:w="3000"/>
-          </w:tcPr>
-          <w:p>
-            <w:r>
-              <w:rPr>
-                <w:b w:val="false"/>
-                <w:bCs w:val="false"/>
-              </w:rPr>
-              <w:t xml:space="preserve">MAE (days)</w:t>
-            </w:r>
-          </w:p>
-        </w:tc>
-        <w:tc>
-          <w:tcPr>
-            <w:tcW w:type="dxa" w:w="3000"/>
-          </w:tcPr>
-          <w:p>
-            <w:r>
-              <w:rPr>
-                <w:b w:val="false"/>
-                <w:bCs w:val="false"/>
-              </w:rPr>
-              <w:t xml:space="preserve">6.01</w:t>
-            </w:r>
-          </w:p>
-        </w:tc>
-        <w:tc>
-          <w:tcPr>
-            <w:tcW w:type="dxa" w:w="3000"/>
-          </w:tcPr>
-          <w:p>
-            <w:r>
-              <w:rPr>
-                <w:b w:val="false"/>
-                <w:bCs w:val="false"/>
-              </w:rPr>
-              <w:t xml:space="preserve">5.78</w:t>
+            <w:tcW w:type="dxa" w:w="3300"/>
+          </w:tcPr>
+          <w:p>
+            <w:r>
+              <w:rPr>
+                <w:b w:val="false"/>
+                <w:bCs w:val="false"/>
+                <w:sz w:val="19"/>
+                <w:szCs w:val="19"/>
+              </w:rPr>
+              <w:t xml:space="preserve">Calendar date only</w:t>
+            </w:r>
+          </w:p>
+        </w:tc>
+        <w:tc>
+          <w:tcPr>
+            <w:tcW w:type="dxa" w:w="2100"/>
+          </w:tcPr>
+          <w:p>
+            <w:r>
+              <w:rPr>
+                <w:b w:val="false"/>
+                <w:bCs w:val="false"/>
+                <w:sz w:val="19"/>
+                <w:szCs w:val="19"/>
+              </w:rPr>
+              <w:t xml:space="preserve">Random Forest</w:t>
+            </w:r>
+          </w:p>
+        </w:tc>
+        <w:tc>
+          <w:tcPr>
+            <w:tcW w:type="dxa" w:w="2000"/>
+          </w:tcPr>
+          <w:p>
+            <w:r>
+              <w:rPr>
+                <w:b w:val="false"/>
+                <w:bCs w:val="false"/>
+                <w:sz w:val="19"/>
+                <w:szCs w:val="19"/>
+              </w:rPr>
+              <w:t xml:space="preserve">1.000 ± 0.000</w:t>
+            </w:r>
+          </w:p>
+        </w:tc>
+        <w:tc>
+          <w:tcPr>
+            <w:tcW w:type="dxa" w:w="1600"/>
+          </w:tcPr>
+          <w:p>
+            <w:r>
+              <w:rPr>
+                <w:b w:val="false"/>
+                <w:bCs w:val="false"/>
+                <w:sz w:val="19"/>
+                <w:szCs w:val="19"/>
+              </w:rPr>
+              <w:t xml:space="preserve">0.00</w:t>
             </w:r>
           </w:p>
         </w:tc>
@@ -685,43 +764,395 @@
       <w:tr>
         <w:tc>
           <w:tcPr>
-            <w:tcW w:type="dxa" w:w="3000"/>
-          </w:tcPr>
-          <w:p>
-            <w:r>
-              <w:rPr>
-                <w:b w:val="false"/>
-                <w:bCs w:val="false"/>
-              </w:rPr>
-              <w:t xml:space="preserve">R²</w:t>
-            </w:r>
-          </w:p>
-        </w:tc>
-        <w:tc>
-          <w:tcPr>
-            <w:tcW w:type="dxa" w:w="3000"/>
-          </w:tcPr>
-          <w:p>
-            <w:r>
-              <w:rPr>
-                <w:b w:val="false"/>
-                <w:bCs w:val="false"/>
-              </w:rPr>
-              <w:t xml:space="preserve">0.526</w:t>
-            </w:r>
-          </w:p>
-        </w:tc>
-        <w:tc>
-          <w:tcPr>
-            <w:tcW w:type="dxa" w:w="3000"/>
-          </w:tcPr>
-          <w:p>
-            <w:r>
-              <w:rPr>
-                <w:b w:val="false"/>
-                <w:bCs w:val="false"/>
-              </w:rPr>
-              <w:t xml:space="preserve">0.545</w:t>
+            <w:tcW w:type="dxa" w:w="3300"/>
+          </w:tcPr>
+          <w:p>
+            <w:r>
+              <w:rPr>
+                <w:b w:val="false"/>
+                <w:bCs w:val="false"/>
+                <w:sz w:val="19"/>
+                <w:szCs w:val="19"/>
+              </w:rPr>
+              <w:t xml:space="preserve">Temperature only</w:t>
+            </w:r>
+          </w:p>
+        </w:tc>
+        <w:tc>
+          <w:tcPr>
+            <w:tcW w:type="dxa" w:w="2100"/>
+          </w:tcPr>
+          <w:p>
+            <w:r>
+              <w:rPr>
+                <w:b w:val="false"/>
+                <w:bCs w:val="false"/>
+                <w:sz w:val="19"/>
+                <w:szCs w:val="19"/>
+              </w:rPr>
+              <w:t xml:space="preserve">Random Forest</w:t>
+            </w:r>
+          </w:p>
+        </w:tc>
+        <w:tc>
+          <w:tcPr>
+            <w:tcW w:type="dxa" w:w="2000"/>
+          </w:tcPr>
+          <w:p>
+            <w:r>
+              <w:rPr>
+                <w:b w:val="false"/>
+                <w:bCs w:val="false"/>
+                <w:sz w:val="19"/>
+                <w:szCs w:val="19"/>
+              </w:rPr>
+              <w:t xml:space="preserve">0.633 ± 0.124</w:t>
+            </w:r>
+          </w:p>
+        </w:tc>
+        <w:tc>
+          <w:tcPr>
+            <w:tcW w:type="dxa" w:w="1600"/>
+          </w:tcPr>
+          <w:p>
+            <w:r>
+              <w:rPr>
+                <w:b w:val="false"/>
+                <w:bCs w:val="false"/>
+                <w:sz w:val="19"/>
+                <w:szCs w:val="19"/>
+              </w:rPr>
+              <w:t xml:space="preserve">4.88</w:t>
+            </w:r>
+          </w:p>
+        </w:tc>
+      </w:tr>
+      <w:tr>
+        <w:tc>
+          <w:tcPr>
+            <w:tcW w:type="dxa" w:w="3300"/>
+          </w:tcPr>
+          <w:p>
+            <w:r>
+              <w:rPr>
+                <w:b w:val="false"/>
+                <w:bCs w:val="false"/>
+                <w:sz w:val="19"/>
+                <w:szCs w:val="19"/>
+              </w:rPr>
+              <w:t xml:space="preserve">All four sensors</w:t>
+            </w:r>
+          </w:p>
+        </w:tc>
+        <w:tc>
+          <w:tcPr>
+            <w:tcW w:type="dxa" w:w="2100"/>
+          </w:tcPr>
+          <w:p>
+            <w:r>
+              <w:rPr>
+                <w:b w:val="false"/>
+                <w:bCs w:val="false"/>
+                <w:sz w:val="19"/>
+                <w:szCs w:val="19"/>
+              </w:rPr>
+              <w:t xml:space="preserve">Random Forest</w:t>
+            </w:r>
+          </w:p>
+        </w:tc>
+        <w:tc>
+          <w:tcPr>
+            <w:tcW w:type="dxa" w:w="2000"/>
+          </w:tcPr>
+          <w:p>
+            <w:r>
+              <w:rPr>
+                <w:b w:val="false"/>
+                <w:bCs w:val="false"/>
+                <w:sz w:val="19"/>
+                <w:szCs w:val="19"/>
+              </w:rPr>
+              <w:t xml:space="preserve">0.624 ± 0.118</w:t>
+            </w:r>
+          </w:p>
+        </w:tc>
+        <w:tc>
+          <w:tcPr>
+            <w:tcW w:type="dxa" w:w="1600"/>
+          </w:tcPr>
+          <w:p>
+            <w:r>
+              <w:rPr>
+                <w:b w:val="false"/>
+                <w:bCs w:val="false"/>
+                <w:sz w:val="19"/>
+                <w:szCs w:val="19"/>
+              </w:rPr>
+              <w:t xml:space="preserve">5.00</w:t>
+            </w:r>
+          </w:p>
+        </w:tc>
+      </w:tr>
+      <w:tr>
+        <w:tc>
+          <w:tcPr>
+            <w:tcW w:type="dxa" w:w="3300"/>
+          </w:tcPr>
+          <w:p>
+            <w:r>
+              <w:rPr>
+                <w:b w:val="false"/>
+                <w:bCs w:val="false"/>
+                <w:sz w:val="19"/>
+                <w:szCs w:val="19"/>
+              </w:rPr>
+              <w:t xml:space="preserve">All four sensors</w:t>
+            </w:r>
+          </w:p>
+        </w:tc>
+        <w:tc>
+          <w:tcPr>
+            <w:tcW w:type="dxa" w:w="2100"/>
+          </w:tcPr>
+          <w:p>
+            <w:r>
+              <w:rPr>
+                <w:b w:val="false"/>
+                <w:bCs w:val="false"/>
+                <w:sz w:val="19"/>
+                <w:szCs w:val="19"/>
+              </w:rPr>
+              <w:t xml:space="preserve">Gradient boosting</w:t>
+            </w:r>
+          </w:p>
+        </w:tc>
+        <w:tc>
+          <w:tcPr>
+            <w:tcW w:type="dxa" w:w="2000"/>
+          </w:tcPr>
+          <w:p>
+            <w:r>
+              <w:rPr>
+                <w:b w:val="false"/>
+                <w:bCs w:val="false"/>
+                <w:sz w:val="19"/>
+                <w:szCs w:val="19"/>
+              </w:rPr>
+              <w:t xml:space="preserve">0.614 ± 0.121</w:t>
+            </w:r>
+          </w:p>
+        </w:tc>
+        <w:tc>
+          <w:tcPr>
+            <w:tcW w:type="dxa" w:w="1600"/>
+          </w:tcPr>
+          <w:p>
+            <w:r>
+              <w:rPr>
+                <w:b w:val="false"/>
+                <w:bCs w:val="false"/>
+                <w:sz w:val="19"/>
+                <w:szCs w:val="19"/>
+              </w:rPr>
+              <w:t xml:space="preserve">5.35</w:t>
+            </w:r>
+          </w:p>
+        </w:tc>
+      </w:tr>
+      <w:tr>
+        <w:tc>
+          <w:tcPr>
+            <w:tcW w:type="dxa" w:w="3300"/>
+          </w:tcPr>
+          <w:p>
+            <w:r>
+              <w:rPr>
+                <w:b w:val="false"/>
+                <w:bCs w:val="false"/>
+                <w:sz w:val="19"/>
+                <w:szCs w:val="19"/>
+              </w:rPr>
+              <w:t xml:space="preserve">All four sensors</w:t>
+            </w:r>
+          </w:p>
+        </w:tc>
+        <w:tc>
+          <w:tcPr>
+            <w:tcW w:type="dxa" w:w="2100"/>
+          </w:tcPr>
+          <w:p>
+            <w:r>
+              <w:rPr>
+                <w:b w:val="false"/>
+                <w:bCs w:val="false"/>
+                <w:sz w:val="19"/>
+                <w:szCs w:val="19"/>
+              </w:rPr>
+              <w:t xml:space="preserve">Linear regression</w:t>
+            </w:r>
+          </w:p>
+        </w:tc>
+        <w:tc>
+          <w:tcPr>
+            <w:tcW w:type="dxa" w:w="2000"/>
+          </w:tcPr>
+          <w:p>
+            <w:r>
+              <w:rPr>
+                <w:b w:val="false"/>
+                <w:bCs w:val="false"/>
+                <w:sz w:val="19"/>
+                <w:szCs w:val="19"/>
+              </w:rPr>
+              <w:t xml:space="preserve">0.003 ± 0.005</w:t>
+            </w:r>
+          </w:p>
+        </w:tc>
+        <w:tc>
+          <w:tcPr>
+            <w:tcW w:type="dxa" w:w="1600"/>
+          </w:tcPr>
+          <w:p>
+            <w:r>
+              <w:rPr>
+                <w:b w:val="false"/>
+                <w:bCs w:val="false"/>
+                <w:sz w:val="19"/>
+                <w:szCs w:val="19"/>
+              </w:rPr>
+              <w:t xml:space="preserve">11.29</w:t>
+            </w:r>
+          </w:p>
+        </w:tc>
+      </w:tr>
+      <w:tr>
+        <w:tc>
+          <w:tcPr>
+            <w:tcW w:type="dxa" w:w="3300"/>
+          </w:tcPr>
+          <w:p>
+            <w:r>
+              <w:rPr>
+                <w:b w:val="false"/>
+                <w:bCs w:val="false"/>
+                <w:sz w:val="19"/>
+                <w:szCs w:val="19"/>
+              </w:rPr>
+              <w:t xml:space="preserve">Humidity + TDS + pH (no temperature)</w:t>
+            </w:r>
+          </w:p>
+        </w:tc>
+        <w:tc>
+          <w:tcPr>
+            <w:tcW w:type="dxa" w:w="2100"/>
+          </w:tcPr>
+          <w:p>
+            <w:r>
+              <w:rPr>
+                <w:b w:val="false"/>
+                <w:bCs w:val="false"/>
+                <w:sz w:val="19"/>
+                <w:szCs w:val="19"/>
+              </w:rPr>
+              <w:t xml:space="preserve">Random Forest</w:t>
+            </w:r>
+          </w:p>
+        </w:tc>
+        <w:tc>
+          <w:tcPr>
+            <w:tcW w:type="dxa" w:w="2000"/>
+          </w:tcPr>
+          <w:p>
+            <w:r>
+              <w:rPr>
+                <w:b w:val="false"/>
+                <w:bCs w:val="false"/>
+                <w:sz w:val="19"/>
+                <w:szCs w:val="19"/>
+              </w:rPr>
+              <w:t xml:space="preserve">-0.038 ± 0.016</w:t>
+            </w:r>
+          </w:p>
+        </w:tc>
+        <w:tc>
+          <w:tcPr>
+            <w:tcW w:type="dxa" w:w="1600"/>
+          </w:tcPr>
+          <w:p>
+            <w:r>
+              <w:rPr>
+                <w:b w:val="false"/>
+                <w:bCs w:val="false"/>
+                <w:sz w:val="19"/>
+                <w:szCs w:val="19"/>
+              </w:rPr>
+              <w:t xml:space="preserve">11.45</w:t>
+            </w:r>
+          </w:p>
+        </w:tc>
+      </w:tr>
+      <w:tr>
+        <w:tc>
+          <w:tcPr>
+            <w:tcW w:type="dxa" w:w="3300"/>
+          </w:tcPr>
+          <w:p>
+            <w:r>
+              <w:rPr>
+                <w:b w:val="false"/>
+                <w:bCs w:val="false"/>
+                <w:sz w:val="19"/>
+                <w:szCs w:val="19"/>
+              </w:rPr>
+              <w:t xml:space="preserve">Mean baseline</w:t>
+            </w:r>
+          </w:p>
+        </w:tc>
+        <w:tc>
+          <w:tcPr>
+            <w:tcW w:type="dxa" w:w="2100"/>
+          </w:tcPr>
+          <w:p>
+            <w:r>
+              <w:rPr>
+                <w:b w:val="false"/>
+                <w:bCs w:val="false"/>
+                <w:sz w:val="19"/>
+                <w:szCs w:val="19"/>
+              </w:rPr>
+              <w:t xml:space="preserve">-</w:t>
+            </w:r>
+          </w:p>
+        </w:tc>
+        <w:tc>
+          <w:tcPr>
+            <w:tcW w:type="dxa" w:w="2000"/>
+          </w:tcPr>
+          <w:p>
+            <w:r>
+              <w:rPr>
+                <w:b w:val="false"/>
+                <w:bCs w:val="false"/>
+                <w:sz w:val="19"/>
+                <w:szCs w:val="19"/>
+              </w:rPr>
+              <w:t xml:space="preserve">0.000 ± 0.000</w:t>
+            </w:r>
+          </w:p>
+        </w:tc>
+        <w:tc>
+          <w:tcPr>
+            <w:tcW w:type="dxa" w:w="1600"/>
+          </w:tcPr>
+          <w:p>
+            <w:r>
+              <w:rPr>
+                <w:b w:val="false"/>
+                <w:bCs w:val="false"/>
+                <w:sz w:val="19"/>
+                <w:szCs w:val="19"/>
+              </w:rPr>
+              <w:t xml:space="preserve">11.32</w:t>
             </w:r>
           </w:p>
         </w:tc>
@@ -729,15 +1160,15 @@
     </w:tbl>
     <w:p>
       <w:pPr>
+        <w:spacing w:after="120"/>
+      </w:pPr>
+    </w:p>
+    <w:p>
+      <w:pPr>
         <w:spacing w:after="150"/>
       </w:pPr>
-    </w:p>
-    <w:p>
-      <w:pPr>
-        <w:spacing w:after="150"/>
-      </w:pPr>
-      <w:r>
-        <w:t xml:space="preserve">Feature importance was heavily dominated by temperature (0.873), with TDS (0.061), humidity (0.043), and pH (0.023) contributing comparatively little. This is consistent with established plant physiology: temperature is a primary driver of growth rate, and this finding is directly relevant to Gulf-region deployment, where ambient heat is a dominant environmental stressor relative to temperate climates.</w:t>
+      <w:r>
+        <w:t xml:space="preserve">All 70 plants started on the same date (2023-08-03). Growth Day is therefore the calendar date minus a constant, and calendar date alone predicts it perfectly. Temperature predicts it only because the temperature trace identifies the day within a single shared period: within individual plants, temperature and growth day are negatively correlated in 83% of plants (median Spearman ρ = -0.27) as conditions cooled from August into September, the opposite of what a growth-promoting effect of warmth would produce. Humidity, TDS and pH carry essentially no information.</w:t>
       </w:r>
     </w:p>
     <w:p>
@@ -746,7 +1177,7 @@
         <w:spacing w:after="100" w:before="200"/>
       </w:pPr>
       <w:r>
-        <w:t xml:space="preserve">4.4 Limitation</w:t>
+        <w:t xml:space="preserve">4.4 Interpretation</w:t>
       </w:r>
     </w:p>
     <w:p>
@@ -754,7 +1185,15 @@
         <w:spacing w:after="150"/>
       </w:pPr>
       <w:r>
-        <w:t xml:space="preserve">An R² of approximately 0.55 indicates roughly half the variance in growth day is unexplained by these four features alone. Likely missing contributors include light exposure duration/intensity, nutrient dosing schedule, and individual plant genetic variation — none of which are present in this dataset. This is noted as a data limitation rather than a modeling failure.</w:t>
+        <w:t xml:space="preserve">This dataset cannot support the claim that temperature drives growth stage. An earlier version of this analysis reported temperature as the dominant feature (random-forest importance 0.87) and linked it to heat stress in Gulf climates; that interpretation is withdrawn, because the importance reflects the shared calendar rather than plant biology. The model is best described as a date detector. A valid test of environmental effects on growth would require staggered planting dates, so that environment and plant age vary independently, and held-out cohorts or seasons for evaluation.</w:t>
+      </w:r>
+    </w:p>
+    <w:p>
+      <w:pPr>
+        <w:spacing w:after="150"/>
+      </w:pPr>
+      <w:r>
+        <w:t xml:space="preserve">The finding is retained deliberately: it shows that grouped cross-validation alone does not protect against a design confound, and it motivates collecting purpose-built data.</w:t>
       </w:r>
     </w:p>
     <w:p>
@@ -771,7 +1210,7 @@
         <w:spacing w:after="150"/>
       </w:pPr>
       <w:r>
-        <w:t xml:space="preserve">Both components are integrated into a single Streamlit application (app/app.py) allowing live testing: uploading a leaf image returns a classification with confidence scores, and adjusting sensor sliders returns a predicted growth day. This was prioritized specifically to make the system's outputs directly observable rather than requiring inspection of code or logs.</w:t>
+        <w:t xml:space="preserve">Both models are available in a Streamlit application (app/app.py). The growth-day tab is labelled as a demonstration of a model with the confound described above, not as a validated predictor.</w:t>
       </w:r>
     </w:p>
     <w:p>
@@ -793,7 +1232,7 @@
         <w:spacing w:after="80"/>
       </w:pPr>
       <w:r>
-        <w:t xml:space="preserve">Multi-modal fusion: combining the vision model's leaf-level stress signal with the sensor model's environmental trend, hypothesized to enable earlier and more reliable stress detection than either signal alone — the central motivating direction of this project.</w:t>
+        <w:t xml:space="preserve">Collect an original dataset with staggered planting dates, logged air and root-zone temperature, light, and nutrient dosing, using a low-cost sensor node and camera, so that fusion can be tested on data that permits valid conclusions.</w:t>
       </w:r>
     </w:p>
     <w:p>
@@ -806,7 +1245,7 @@
         <w:spacing w:after="80"/>
       </w:pPr>
       <w:r>
-        <w:t xml:space="preserve">Gulf-specific stress classes: incorporating salinity stress and heat stress as explicit classes, using region-representative water chemistry and climate conditions, and validating on region-relevant cultivars.</w:t>
+        <w:t xml:space="preserve">Multi-modal fusion of leaf imagery with sensor time series, evaluated against each modality alone under group-aware, temporal and external validation.</w:t>
       </w:r>
     </w:p>
     <w:p>
@@ -819,7 +1258,7 @@
         <w:spacing w:after="80"/>
       </w:pPr>
       <w:r>
-        <w:t xml:space="preserve">Edge deployment: running inference on-device (e.g., Raspberry Pi or Jetson Nano) to support low-connectivity farm environments.</w:t>
+        <w:t xml:space="preserve">Heat- and salinity-stress classes relevant to arid-region cultivation, which are not covered by the datasets used here.</w:t>
       </w:r>
     </w:p>
     <w:p>
@@ -832,7 +1271,20 @@
         <w:spacing w:after="80"/>
       </w:pPr>
       <w:r>
-        <w:t xml:space="preserve">Expanded data collection: particularly for underrepresented classes (Nitrogen deficiency) and additional environmental features (light exposure, nutrient dosing schedule) to improve growth-prediction accuracy.</w:t>
+        <w:t xml:space="preserve">Larger and more diverse image data, with plant identifiers, to replace the small single-farm dataset; explainability analysis (Grad-CAM) to check that the network attends to the leaf.</w:t>
+      </w:r>
+    </w:p>
+    <w:p>
+      <w:pPr>
+        <w:pStyle w:val="ListParagraph"/>
+        <w:numPr>
+          <w:ilvl w:val="0"/>
+          <w:numId w:val="1"/>
+        </w:numPr>
+        <w:spacing w:after="80"/>
+      </w:pPr>
+      <w:r>
+        <w:t xml:space="preserve">A systematic review of validation practice in machine-learning studies of hydroponic monitoring, using this case study as a worked example.</w:t>
       </w:r>
     </w:p>
     <w:p>
@@ -849,7 +1301,7 @@
         <w:spacing w:after="150"/>
       </w:pPr>
       <w:r>
-        <w:t xml:space="preserve">This project demonstrates two independently functioning, evaluated AI components relevant to indoor hydroponic farm monitoring, built and documented end-to-end: data acquisition, reproducible train/val/test splitting, model training, rigorous per-class evaluation, and an interactive demonstration. Honest reporting of each component's limitations — rather than only favorable results — is intended to reflect the kind of methodological rigor expected of research work, and to establish a concrete foundation for the multi-modal fusion research direction proposed above.</w:t>
+        <w:t xml:space="preserve">This project delivers a working vision classifier and sensor model with reproducible pipelines, a demonstration application, and a candid validity analysis. The analysis found two specific problems in public data: near-duplicate images that inflate single-split accuracy, and a sensor dataset in which all plants share one calendar, making any temperature effect unidentifiable. The main contribution is not a performance figure but the demonstration of how such problems are detected, and a concrete plan for data collection and fusion research that avoids them.</w:t>
       </w:r>
     </w:p>
     <w:p>
@@ -858,7 +1310,7 @@
         <w:spacing w:after="150" w:before="300"/>
       </w:pPr>
       <w:r>
-        <w:t xml:space="preserve">References &amp; Data Sources</w:t>
+        <w:t xml:space="preserve">Data Sources and Code</w:t>
       </w:r>
     </w:p>
     <w:p>
@@ -870,7 +1322,7 @@
           <w:sz w:val="20"/>
           <w:szCs w:val="20"/>
         </w:rPr>
-        <w:t xml:space="preserve">Rathor, A. "Lettuce Plant Leaf Disease Dataset." Kaggle, CC0 Public Domain.</w:t>
+        <w:t xml:space="preserve">Rathor, A. Lettuce Plant Leaf Disease Dataset. Kaggle, CC0.</w:t>
       </w:r>
     </w:p>
     <w:p>
@@ -882,7 +1334,7 @@
           <w:sz w:val="20"/>
           <w:szCs w:val="20"/>
         </w:rPr>
-        <w:t xml:space="preserve">jurijsruko. "Lettuce Growth Days." Kaggle, Apache-2.0 License.</w:t>
+        <w:t xml:space="preserve">jurijsruko. Lettuce Growth Days. Kaggle, Apache-2.0.</w:t>
       </w:r>
     </w:p>
     <w:p>
@@ -894,7 +1346,7 @@
           <w:sz w:val="20"/>
           <w:szCs w:val="20"/>
         </w:rPr>
-        <w:t xml:space="preserve">Full code, data pipeline, and documentation: github.com/HabibAdnan4286/hydroponic-ai-project</w:t>
+        <w:t xml:space="preserve">Code and documentation: github.com/HabibAdnan4286/hydroponic-ai-project</w:t>
       </w:r>
     </w:p>
     <w:sectPr>

</xml_diff>

<commit_message>
Report cross-validated vision results; withdraw single-split and class-weighting claims
</commit_message>
<xml_diff>
--- a/docs/technical_report.docx
+++ b/docs/technical_report.docx
@@ -152,7 +152,7 @@
         <w:spacing w:after="150"/>
       </w:pPr>
       <w:r>
-        <w:t xml:space="preserve">Images were split 70/15/15 with stratification by class. A MobileNetV2 backbone pretrained on ImageNet was used with a frozen feature extractor and a trained classification head, with rotation, colour-jitter and random-crop augmentation on the training set. A second run applied inverse-frequency class weighting to the loss.</w:t>
+        <w:t xml:space="preserve">Evaluation used 5-fold cross-validation, stratified by class, with near-duplicate images (see 3.4) kept in the same fold. A MobileNetV2 backbone pretrained on ImageNet was used with a frozen feature extractor and a trained classification head, with rotation, colour-jitter and random-crop augmentation on the training set. A second run applied inverse-frequency class weighting to the loss.</w:t>
       </w:r>
     </w:p>
     <w:p>
@@ -161,7 +161,7 @@
         <w:spacing w:after="100" w:before="200"/>
       </w:pPr>
       <w:r>
-        <w:t xml:space="preserve">3.3 Results (single split, indicative only)</w:t>
+        <w:t xml:space="preserve">3.3 Results (5-fold group-aware cross-validation)</w:t>
       </w:r>
     </w:p>
     <w:tbl>
@@ -177,15 +177,14 @@
         </w:tblBorders>
       </w:tblPr>
       <w:tblGrid>
-        <w:gridCol w:w="2250"/>
-        <w:gridCol w:w="2250"/>
-        <w:gridCol w:w="2250"/>
-        <w:gridCol w:w="2250"/>
+        <w:gridCol w:w="3900"/>
+        <w:gridCol w:w="2400"/>
+        <w:gridCol w:w="2700"/>
       </w:tblGrid>
       <w:tr>
         <w:tc>
           <w:tcPr>
-            <w:tcW w:type="dxa" w:w="2250"/>
+            <w:tcW w:type="dxa" w:w="3900"/>
             <w:shd w:fill="2E5339" w:val="clear"/>
           </w:tcPr>
           <w:p>
@@ -197,13 +196,13 @@
                 <w:sz w:val="19"/>
                 <w:szCs w:val="19"/>
               </w:rPr>
-              <w:t xml:space="preserve">Class</w:t>
-            </w:r>
-          </w:p>
-        </w:tc>
-        <w:tc>
-          <w:tcPr>
-            <w:tcW w:type="dxa" w:w="2250"/>
+              <w:t xml:space="preserve">Metric</w:t>
+            </w:r>
+          </w:p>
+        </w:tc>
+        <w:tc>
+          <w:tcPr>
+            <w:tcW w:type="dxa" w:w="2400"/>
             <w:shd w:fill="2E5339" w:val="clear"/>
           </w:tcPr>
           <w:p>
@@ -215,13 +214,13 @@
                 <w:sz w:val="19"/>
                 <w:szCs w:val="19"/>
               </w:rPr>
-              <w:t xml:space="preserve">Precision</w:t>
-            </w:r>
-          </w:p>
-        </w:tc>
-        <w:tc>
-          <w:tcPr>
-            <w:tcW w:type="dxa" w:w="2250"/>
+              <w:t xml:space="preserve">Standard loss</w:t>
+            </w:r>
+          </w:p>
+        </w:tc>
+        <w:tc>
+          <w:tcPr>
+            <w:tcW w:type="dxa" w:w="2700"/>
             <w:shd w:fill="2E5339" w:val="clear"/>
           </w:tcPr>
           <w:p>
@@ -233,25 +232,7 @@
                 <w:sz w:val="19"/>
                 <w:szCs w:val="19"/>
               </w:rPr>
-              <w:t xml:space="preserve">Recall</w:t>
-            </w:r>
-          </w:p>
-        </w:tc>
-        <w:tc>
-          <w:tcPr>
-            <w:tcW w:type="dxa" w:w="2250"/>
-            <w:shd w:fill="2E5339" w:val="clear"/>
-          </w:tcPr>
-          <w:p>
-            <w:r>
-              <w:rPr>
-                <w:b/>
-                <w:bCs/>
-                <w:color w:val="FFFFFF"/>
-                <w:sz w:val="19"/>
-                <w:szCs w:val="19"/>
-              </w:rPr>
-              <w:t xml:space="preserve">F1</w:t>
+              <w:t xml:space="preserve">Class-weighted loss</w:t>
             </w:r>
           </w:p>
         </w:tc>
@@ -259,65 +240,49 @@
       <w:tr>
         <w:tc>
           <w:tcPr>
-            <w:tcW w:type="dxa" w:w="2250"/>
-          </w:tcPr>
-          <w:p>
-            <w:r>
-              <w:rPr>
-                <w:b w:val="false"/>
-                <w:bCs w:val="false"/>
-                <w:sz w:val="19"/>
-                <w:szCs w:val="19"/>
-              </w:rPr>
-              <w:t xml:space="preserve">Healthy</w:t>
-            </w:r>
-          </w:p>
-        </w:tc>
-        <w:tc>
-          <w:tcPr>
-            <w:tcW w:type="dxa" w:w="2250"/>
-          </w:tcPr>
-          <w:p>
-            <w:r>
-              <w:rPr>
-                <w:b w:val="false"/>
-                <w:bCs w:val="false"/>
-                <w:sz w:val="19"/>
-                <w:szCs w:val="19"/>
-              </w:rPr>
-              <w:t xml:space="preserve">1.00</w:t>
-            </w:r>
-          </w:p>
-        </w:tc>
-        <w:tc>
-          <w:tcPr>
-            <w:tcW w:type="dxa" w:w="2250"/>
-          </w:tcPr>
-          <w:p>
-            <w:r>
-              <w:rPr>
-                <w:b w:val="false"/>
-                <w:bCs w:val="false"/>
-                <w:sz w:val="19"/>
-                <w:szCs w:val="19"/>
-              </w:rPr>
-              <w:t xml:space="preserve">0.90</w:t>
-            </w:r>
-          </w:p>
-        </w:tc>
-        <w:tc>
-          <w:tcPr>
-            <w:tcW w:type="dxa" w:w="2250"/>
-          </w:tcPr>
-          <w:p>
-            <w:r>
-              <w:rPr>
-                <w:b w:val="false"/>
-                <w:bCs w:val="false"/>
-                <w:sz w:val="19"/>
-                <w:szCs w:val="19"/>
-              </w:rPr>
-              <w:t xml:space="preserve">0.95</w:t>
+            <w:tcW w:type="dxa" w:w="3900"/>
+          </w:tcPr>
+          <w:p>
+            <w:r>
+              <w:rPr>
+                <w:b w:val="false"/>
+                <w:bCs w:val="false"/>
+                <w:sz w:val="19"/>
+                <w:szCs w:val="19"/>
+              </w:rPr>
+              <w:t xml:space="preserve">Overall accuracy (mean ± SD over folds)</w:t>
+            </w:r>
+          </w:p>
+        </w:tc>
+        <w:tc>
+          <w:tcPr>
+            <w:tcW w:type="dxa" w:w="2400"/>
+          </w:tcPr>
+          <w:p>
+            <w:r>
+              <w:rPr>
+                <w:b w:val="false"/>
+                <w:bCs w:val="false"/>
+                <w:sz w:val="19"/>
+                <w:szCs w:val="19"/>
+              </w:rPr>
+              <w:t xml:space="preserve">0.842 ± 0.090</w:t>
+            </w:r>
+          </w:p>
+        </w:tc>
+        <w:tc>
+          <w:tcPr>
+            <w:tcW w:type="dxa" w:w="2700"/>
+          </w:tcPr>
+          <w:p>
+            <w:r>
+              <w:rPr>
+                <w:b w:val="false"/>
+                <w:bCs w:val="false"/>
+                <w:sz w:val="19"/>
+                <w:szCs w:val="19"/>
+              </w:rPr>
+              <w:t xml:space="preserve">0.833 ± 0.097</w:t>
             </w:r>
           </w:p>
         </w:tc>
@@ -325,65 +290,49 @@
       <w:tr>
         <w:tc>
           <w:tcPr>
-            <w:tcW w:type="dxa" w:w="2250"/>
-          </w:tcPr>
-          <w:p>
-            <w:r>
-              <w:rPr>
-                <w:b w:val="false"/>
-                <w:bCs w:val="false"/>
-                <w:sz w:val="19"/>
-                <w:szCs w:val="19"/>
-              </w:rPr>
-              <w:t xml:space="preserve">K deficient</w:t>
-            </w:r>
-          </w:p>
-        </w:tc>
-        <w:tc>
-          <w:tcPr>
-            <w:tcW w:type="dxa" w:w="2250"/>
-          </w:tcPr>
-          <w:p>
-            <w:r>
-              <w:rPr>
-                <w:b w:val="false"/>
-                <w:bCs w:val="false"/>
-                <w:sz w:val="19"/>
-                <w:szCs w:val="19"/>
-              </w:rPr>
-              <w:t xml:space="preserve">0.91</w:t>
-            </w:r>
-          </w:p>
-        </w:tc>
-        <w:tc>
-          <w:tcPr>
-            <w:tcW w:type="dxa" w:w="2250"/>
-          </w:tcPr>
-          <w:p>
-            <w:r>
-              <w:rPr>
-                <w:b w:val="false"/>
-                <w:bCs w:val="false"/>
-                <w:sz w:val="19"/>
-                <w:szCs w:val="19"/>
-              </w:rPr>
-              <w:t xml:space="preserve">0.91</w:t>
-            </w:r>
-          </w:p>
-        </w:tc>
-        <w:tc>
-          <w:tcPr>
-            <w:tcW w:type="dxa" w:w="2250"/>
-          </w:tcPr>
-          <w:p>
-            <w:r>
-              <w:rPr>
-                <w:b w:val="false"/>
-                <w:bCs w:val="false"/>
-                <w:sz w:val="19"/>
-                <w:szCs w:val="19"/>
-              </w:rPr>
-              <w:t xml:space="preserve">0.91</w:t>
+            <w:tcW w:type="dxa" w:w="3900"/>
+          </w:tcPr>
+          <w:p>
+            <w:r>
+              <w:rPr>
+                <w:b w:val="false"/>
+                <w:bCs w:val="false"/>
+                <w:sz w:val="19"/>
+                <w:szCs w:val="19"/>
+              </w:rPr>
+              <w:t xml:space="preserve">Accuracy, pooled 95% bootstrap CI</w:t>
+            </w:r>
+          </w:p>
+        </w:tc>
+        <w:tc>
+          <w:tcPr>
+            <w:tcW w:type="dxa" w:w="2400"/>
+          </w:tcPr>
+          <w:p>
+            <w:r>
+              <w:rPr>
+                <w:b w:val="false"/>
+                <w:bCs w:val="false"/>
+                <w:sz w:val="19"/>
+                <w:szCs w:val="19"/>
+              </w:rPr>
+              <w:t xml:space="preserve">[0.789, 0.890]</w:t>
+            </w:r>
+          </w:p>
+        </w:tc>
+        <w:tc>
+          <w:tcPr>
+            <w:tcW w:type="dxa" w:w="2700"/>
+          </w:tcPr>
+          <w:p>
+            <w:r>
+              <w:rPr>
+                <w:b w:val="false"/>
+                <w:bCs w:val="false"/>
+                <w:sz w:val="19"/>
+                <w:szCs w:val="19"/>
+              </w:rPr>
+              <w:t xml:space="preserve">[0.780, 0.880]</w:t>
             </w:r>
           </w:p>
         </w:tc>
@@ -391,65 +340,49 @@
       <w:tr>
         <w:tc>
           <w:tcPr>
-            <w:tcW w:type="dxa" w:w="2250"/>
-          </w:tcPr>
-          <w:p>
-            <w:r>
-              <w:rPr>
-                <w:b w:val="false"/>
-                <w:bCs w:val="false"/>
-                <w:sz w:val="19"/>
-                <w:szCs w:val="19"/>
-              </w:rPr>
-              <w:t xml:space="preserve">N deficient</w:t>
-            </w:r>
-          </w:p>
-        </w:tc>
-        <w:tc>
-          <w:tcPr>
-            <w:tcW w:type="dxa" w:w="2250"/>
-          </w:tcPr>
-          <w:p>
-            <w:r>
-              <w:rPr>
-                <w:b w:val="false"/>
-                <w:bCs w:val="false"/>
-                <w:sz w:val="19"/>
-                <w:szCs w:val="19"/>
-              </w:rPr>
-              <w:t xml:space="preserve">0.86</w:t>
-            </w:r>
-          </w:p>
-        </w:tc>
-        <w:tc>
-          <w:tcPr>
-            <w:tcW w:type="dxa" w:w="2250"/>
-          </w:tcPr>
-          <w:p>
-            <w:r>
-              <w:rPr>
-                <w:b w:val="false"/>
-                <w:bCs w:val="false"/>
-                <w:sz w:val="19"/>
-                <w:szCs w:val="19"/>
-              </w:rPr>
-              <w:t xml:space="preserve">1.00</w:t>
-            </w:r>
-          </w:p>
-        </w:tc>
-        <w:tc>
-          <w:tcPr>
-            <w:tcW w:type="dxa" w:w="2250"/>
-          </w:tcPr>
-          <w:p>
-            <w:r>
-              <w:rPr>
-                <w:b w:val="false"/>
-                <w:bCs w:val="false"/>
-                <w:sz w:val="19"/>
-                <w:szCs w:val="19"/>
-              </w:rPr>
-              <w:t xml:space="preserve">0.92</w:t>
+            <w:tcW w:type="dxa" w:w="3900"/>
+          </w:tcPr>
+          <w:p>
+            <w:r>
+              <w:rPr>
+                <w:b w:val="false"/>
+                <w:bCs w:val="false"/>
+                <w:sz w:val="19"/>
+                <w:szCs w:val="19"/>
+              </w:rPr>
+              <w:t xml:space="preserve">Macro-F1</w:t>
+            </w:r>
+          </w:p>
+        </w:tc>
+        <w:tc>
+          <w:tcPr>
+            <w:tcW w:type="dxa" w:w="2400"/>
+          </w:tcPr>
+          <w:p>
+            <w:r>
+              <w:rPr>
+                <w:b w:val="false"/>
+                <w:bCs w:val="false"/>
+                <w:sz w:val="19"/>
+                <w:szCs w:val="19"/>
+              </w:rPr>
+              <w:t xml:space="preserve">0.837 ± 0.084</w:t>
+            </w:r>
+          </w:p>
+        </w:tc>
+        <w:tc>
+          <w:tcPr>
+            <w:tcW w:type="dxa" w:w="2700"/>
+          </w:tcPr>
+          <w:p>
+            <w:r>
+              <w:rPr>
+                <w:b w:val="false"/>
+                <w:bCs w:val="false"/>
+                <w:sz w:val="19"/>
+                <w:szCs w:val="19"/>
+              </w:rPr>
+              <w:t xml:space="preserve">0.829 ± 0.088</w:t>
             </w:r>
           </w:p>
         </w:tc>
@@ -457,65 +390,199 @@
       <w:tr>
         <w:tc>
           <w:tcPr>
-            <w:tcW w:type="dxa" w:w="2250"/>
-          </w:tcPr>
-          <w:p>
-            <w:r>
-              <w:rPr>
-                <w:b w:val="false"/>
-                <w:bCs w:val="false"/>
-                <w:sz w:val="19"/>
-                <w:szCs w:val="19"/>
-              </w:rPr>
-              <w:t xml:space="preserve">Wilt (fungal)</w:t>
-            </w:r>
-          </w:p>
-        </w:tc>
-        <w:tc>
-          <w:tcPr>
-            <w:tcW w:type="dxa" w:w="2250"/>
-          </w:tcPr>
-          <w:p>
-            <w:r>
-              <w:rPr>
-                <w:b w:val="false"/>
-                <w:bCs w:val="false"/>
-                <w:sz w:val="19"/>
-                <w:szCs w:val="19"/>
-              </w:rPr>
-              <w:t xml:space="preserve">0.88</w:t>
-            </w:r>
-          </w:p>
-        </w:tc>
-        <w:tc>
-          <w:tcPr>
-            <w:tcW w:type="dxa" w:w="2250"/>
-          </w:tcPr>
-          <w:p>
-            <w:r>
-              <w:rPr>
-                <w:b w:val="false"/>
-                <w:bCs w:val="false"/>
-                <w:sz w:val="19"/>
-                <w:szCs w:val="19"/>
-              </w:rPr>
-              <w:t xml:space="preserve">0.88</w:t>
-            </w:r>
-          </w:p>
-        </w:tc>
-        <w:tc>
-          <w:tcPr>
-            <w:tcW w:type="dxa" w:w="2250"/>
-          </w:tcPr>
-          <w:p>
-            <w:r>
-              <w:rPr>
-                <w:b w:val="false"/>
-                <w:bCs w:val="false"/>
-                <w:sz w:val="19"/>
-                <w:szCs w:val="19"/>
-              </w:rPr>
-              <w:t xml:space="preserve">0.88</w:t>
+            <w:tcW w:type="dxa" w:w="3900"/>
+          </w:tcPr>
+          <w:p>
+            <w:r>
+              <w:rPr>
+                <w:b w:val="false"/>
+                <w:bCs w:val="false"/>
+                <w:sz w:val="19"/>
+                <w:szCs w:val="19"/>
+              </w:rPr>
+              <w:t xml:space="preserve">Recall: Healthy</w:t>
+            </w:r>
+          </w:p>
+        </w:tc>
+        <w:tc>
+          <w:tcPr>
+            <w:tcW w:type="dxa" w:w="2400"/>
+          </w:tcPr>
+          <w:p>
+            <w:r>
+              <w:rPr>
+                <w:b w:val="false"/>
+                <w:bCs w:val="false"/>
+                <w:sz w:val="19"/>
+                <w:szCs w:val="19"/>
+              </w:rPr>
+              <w:t xml:space="preserve">0.95 ± 0.07</w:t>
+            </w:r>
+          </w:p>
+        </w:tc>
+        <w:tc>
+          <w:tcPr>
+            <w:tcW w:type="dxa" w:w="2700"/>
+          </w:tcPr>
+          <w:p>
+            <w:r>
+              <w:rPr>
+                <w:b w:val="false"/>
+                <w:bCs w:val="false"/>
+                <w:sz w:val="19"/>
+                <w:szCs w:val="19"/>
+              </w:rPr>
+              <w:t xml:space="preserve">0.94 ± 0.10</w:t>
+            </w:r>
+          </w:p>
+        </w:tc>
+      </w:tr>
+      <w:tr>
+        <w:tc>
+          <w:tcPr>
+            <w:tcW w:type="dxa" w:w="3900"/>
+          </w:tcPr>
+          <w:p>
+            <w:r>
+              <w:rPr>
+                <w:b w:val="false"/>
+                <w:bCs w:val="false"/>
+                <w:sz w:val="19"/>
+                <w:szCs w:val="19"/>
+              </w:rPr>
+              <w:t xml:space="preserve">Recall: K deficient</w:t>
+            </w:r>
+          </w:p>
+        </w:tc>
+        <w:tc>
+          <w:tcPr>
+            <w:tcW w:type="dxa" w:w="2400"/>
+          </w:tcPr>
+          <w:p>
+            <w:r>
+              <w:rPr>
+                <w:b w:val="false"/>
+                <w:bCs w:val="false"/>
+                <w:sz w:val="19"/>
+                <w:szCs w:val="19"/>
+              </w:rPr>
+              <w:t xml:space="preserve">0.72 ± 0.27</w:t>
+            </w:r>
+          </w:p>
+        </w:tc>
+        <w:tc>
+          <w:tcPr>
+            <w:tcW w:type="dxa" w:w="2700"/>
+          </w:tcPr>
+          <w:p>
+            <w:r>
+              <w:rPr>
+                <w:b w:val="false"/>
+                <w:bCs w:val="false"/>
+                <w:sz w:val="19"/>
+                <w:szCs w:val="19"/>
+              </w:rPr>
+              <w:t xml:space="preserve">0.71 ± 0.28</w:t>
+            </w:r>
+          </w:p>
+        </w:tc>
+      </w:tr>
+      <w:tr>
+        <w:tc>
+          <w:tcPr>
+            <w:tcW w:type="dxa" w:w="3900"/>
+          </w:tcPr>
+          <w:p>
+            <w:r>
+              <w:rPr>
+                <w:b w:val="false"/>
+                <w:bCs w:val="false"/>
+                <w:sz w:val="19"/>
+                <w:szCs w:val="19"/>
+              </w:rPr>
+              <w:t xml:space="preserve">Recall: N deficient</w:t>
+            </w:r>
+          </w:p>
+        </w:tc>
+        <w:tc>
+          <w:tcPr>
+            <w:tcW w:type="dxa" w:w="2400"/>
+          </w:tcPr>
+          <w:p>
+            <w:r>
+              <w:rPr>
+                <w:b w:val="false"/>
+                <w:bCs w:val="false"/>
+                <w:sz w:val="19"/>
+                <w:szCs w:val="19"/>
+              </w:rPr>
+              <w:t xml:space="preserve">0.86 ± 0.14</w:t>
+            </w:r>
+          </w:p>
+        </w:tc>
+        <w:tc>
+          <w:tcPr>
+            <w:tcW w:type="dxa" w:w="2700"/>
+          </w:tcPr>
+          <w:p>
+            <w:r>
+              <w:rPr>
+                <w:b w:val="false"/>
+                <w:bCs w:val="false"/>
+                <w:sz w:val="19"/>
+                <w:szCs w:val="19"/>
+              </w:rPr>
+              <w:t xml:space="preserve">0.89 ± 0.12</w:t>
+            </w:r>
+          </w:p>
+        </w:tc>
+      </w:tr>
+      <w:tr>
+        <w:tc>
+          <w:tcPr>
+            <w:tcW w:type="dxa" w:w="3900"/>
+          </w:tcPr>
+          <w:p>
+            <w:r>
+              <w:rPr>
+                <w:b w:val="false"/>
+                <w:bCs w:val="false"/>
+                <w:sz w:val="19"/>
+                <w:szCs w:val="19"/>
+              </w:rPr>
+              <w:t xml:space="preserve">Recall: Wilt (fungal)</w:t>
+            </w:r>
+          </w:p>
+        </w:tc>
+        <w:tc>
+          <w:tcPr>
+            <w:tcW w:type="dxa" w:w="2400"/>
+          </w:tcPr>
+          <w:p>
+            <w:r>
+              <w:rPr>
+                <w:b w:val="false"/>
+                <w:bCs w:val="false"/>
+                <w:sz w:val="19"/>
+                <w:szCs w:val="19"/>
+              </w:rPr>
+              <w:t xml:space="preserve">0.84 ± 0.17</w:t>
+            </w:r>
+          </w:p>
+        </w:tc>
+        <w:tc>
+          <w:tcPr>
+            <w:tcW w:type="dxa" w:w="2700"/>
+          </w:tcPr>
+          <w:p>
+            <w:r>
+              <w:rPr>
+                <w:b w:val="false"/>
+                <w:bCs w:val="false"/>
+                <w:sz w:val="19"/>
+                <w:szCs w:val="19"/>
+              </w:rPr>
+              <w:t xml:space="preserve">0.82 ± 0.15</w:t>
             </w:r>
           </w:p>
         </w:tc>
@@ -531,7 +598,15 @@
         <w:spacing w:after="150"/>
       </w:pPr>
       <w:r>
-        <w:t xml:space="preserve">Class-weighted model, 35 held-out images, overall accuracy 91%. The unweighted model reached 94% accuracy but only 67% recall on the nitrogen-deficient class (2 of 6 test images missed); class weighting raised that recall to 100% at a small cost in overall accuracy. With six test images in that class, these differences are within sampling noise and should not be over-interpreted.</w:t>
+        <w:t xml:space="preserve">All 209 images were tested once, in five folds that keep near-duplicate images together (one repeat). Accuracy is about 84%, with a confidence interval of roughly 79–89%; fold accuracies ranged from 0.67 to 0.91, so small splits are noisy. Potassium deficiency was the hardest class (recall about 0.72). Class weighting gave no significant change (exact McNemar test on pooled predictions: p = 0.625; 3 images correct only without weighting, 1 only with it).</w:t>
+      </w:r>
+    </w:p>
+    <w:p>
+      <w:pPr>
+        <w:spacing w:after="150"/>
+      </w:pPr>
+      <w:r>
+        <w:t xml:space="preserve">An earlier single 35-image split gave 91% (94% unweighted) and suggested a nitrogen-deficiency recall gap (67%) that class weighting appeared to fix. That result did not replicate: under cross-validation, nitrogen-deficient recall is 0.86 without weighting. The single-split figures are therefore not reported as results. They rested on six test images in the minority class.</w:t>
       </w:r>
     </w:p>
     <w:p>
@@ -548,7 +623,7 @@
         <w:spacing w:after="150"/>
       </w:pPr>
       <w:r>
-        <w:t xml:space="preserve">The dataset has no plant identifiers. A 64-bit perceptual-hash analysis found 25 groups of near-duplicate images (52 of 209 images) and showed that 3 of the 35 test images (8.6%) have a near-identical image in the training set. The single-split accuracy is therefore probably optimistic. Group-aware cross-validation, with near-duplicates kept in the same fold, is used to produce the reportable estimate. The hash check cannot detect different views of the same plant, so some leakage may remain undetected.</w:t>
+        <w:t xml:space="preserve">The dataset has no plant identifiers. A 64-bit perceptual-hash analysis found 25 groups of near-duplicate images (52 of 209 images) and showed that 3 of the 35 test images (8.6%) have a near-identical image in the training set. The single-split accuracy is therefore probably optimistic. Group-aware cross-validation, with near-duplicates kept in the same fold, produces the estimates in Section 3.3. The hash check cannot detect different views of the same plant, so some leakage may remain undetected.</w:t>
       </w:r>
     </w:p>
     <w:p>
@@ -1301,7 +1376,7 @@
         <w:spacing w:after="150"/>
       </w:pPr>
       <w:r>
-        <w:t xml:space="preserve">This project delivers a working vision classifier and sensor model with reproducible pipelines, a demonstration application, and a candid validity analysis. The analysis found two specific problems in public data: near-duplicate images that inflate single-split accuracy, and a sensor dataset in which all plants share one calendar, making any temperature effect unidentifiable. The main contribution is not a performance figure but the demonstration of how such problems are detected, and a concrete plan for data collection and fusion research that avoids them.</w:t>
+        <w:t xml:space="preserve">This project delivers a working vision classifier and sensor model with reproducible pipelines, a demonstration application, and a candid validity analysis. The analysis found two specific problems in public data: near-duplicate images, and a sensor dataset in which all plants share one calendar, making any temperature effect unidentifiable. It also showed that a single small split overstated accuracy (91% against about 84% under cross-validation) and produced an apparent class-weighting benefit that did not replicate. The main contribution is not a performance figure but the demonstration of how such problems are detected, and a concrete plan for data collection and fusion research that avoids them.</w:t>
       </w:r>
     </w:p>
     <w:p>

</xml_diff>